<commit_message>
V2.0 DVT report, Rev D user guide and pinout, page updates
</commit_message>
<xml_diff>
--- a/esp32-s3/docs/DVT_Firmware_Guide.docx
+++ b/esp32-s3/docs/DVT_Firmware_Guide.docx
@@ -46,7 +46,7 @@
           <w:sz w:val="21"/>
           <w:szCs w:val="21"/>
         </w:rPr>
-        <w:t xml:space="preserve">ESP32-S3-WROOM-1-N8 product board, fab rev 2026-06-28.   </w:t>
+        <w:t xml:space="preserve">ESP32-S3-WROOM-1-N8 product board (pin map verified on V1.0 and V2.0).   </w:t>
       </w:r>
       <w:r>
         <w:rPr>
@@ -70,7 +70,7 @@
           <w:sz w:val="21"/>
           <w:szCs w:val="21"/>
         </w:rPr>
-        <w:t xml:space="preserve">the DVT_Helper sketch plus the shipping weather-clock demo, and this guide. Pin maps in both use the verified fab-data pins (Appendix B of the DVT plan) — nothing to edit except WiFi credentials where noted.</w:t>
+        <w:t>the DVT_Helper sketch plus the shipping weather-clock demo, and this guide. Pin maps in both use the verified fab-data pins (the same pin map as the user guide) — nothing to edit except WiFi credentials where noted.</w:t>
       </w:r>
     </w:p>
     <w:p>
@@ -87,19 +87,19 @@
           <w:sz w:val="21"/>
           <w:szCs w:val="21"/>
         </w:rPr>
-        <w:t xml:space="preserve">Scope note (Rev A): </w:t>
-      </w:r>
-      <w:r>
-        <w:rPr>
-          <w:rFonts w:ascii="Calibri" w:cs="Calibri" w:eastAsia="Calibri" w:hAnsi="Calibri"/>
-          <w:b w:val="false"/>
-          <w:bCs w:val="false"/>
-          <w:i w:val="false"/>
-          <w:iCs w:val="false"/>
-          <w:sz w:val="20"/>
-          <w:szCs w:val="20"/>
-        </w:rPr>
-        <w:t xml:space="preserve">RainMaker BLE provisioning and Arduino OTA were dropped from the product, so the RainMaker and OTA sketches are no longer part of this pack. The shipping demo provisions over a WiFi captive portal; the BLE radio is still checked for board QA (RF-B-01).</w:t>
+        <w:t xml:space="preserve">Note: </w:t>
+      </w:r>
+      <w:r>
+        <w:rPr>
+          <w:rFonts w:ascii="Calibri" w:cs="Calibri" w:eastAsia="Calibri" w:hAnsi="Calibri"/>
+          <w:b w:val="false"/>
+          <w:bCs w:val="false"/>
+          <w:i w:val="false"/>
+          <w:iCs w:val="false"/>
+          <w:sz w:val="20"/>
+          <w:szCs w:val="20"/>
+        </w:rPr>
+        <w:t>Written for the first prototypes (V1.0). The pin map is the same on V2.0; test IDs refer to the V1.0 plan.</w:t>
       </w:r>
     </w:p>
     <w:tbl>
@@ -556,19 +556,19 @@
           <w:sz w:val="21"/>
           <w:szCs w:val="21"/>
         </w:rPr>
-        <w:t xml:space="preserve">esp32 core 3.x</w:t>
-      </w:r>
-      <w:r>
-        <w:rPr>
-          <w:rFonts w:ascii="Calibri" w:cs="Calibri" w:eastAsia="Calibri" w:hAnsi="Calibri"/>
-          <w:b w:val="false"/>
-          <w:bCs w:val="false"/>
-          <w:i w:val="false"/>
-          <w:iCs w:val="false"/>
-          <w:sz w:val="21"/>
-          <w:szCs w:val="21"/>
-        </w:rPr>
-        <w:t xml:space="preserve"> (Boards Manager → “esp32 by Espressif”).</w:t>
+        <w:t>esp32 by Espressif Systems 3.3.6</w:t>
+      </w:r>
+      <w:r>
+        <w:rPr>
+          <w:rFonts w:ascii="Calibri" w:cs="Calibri" w:eastAsia="Calibri" w:hAnsi="Calibri"/>
+          <w:b w:val="false"/>
+          <w:bCs w:val="false"/>
+          <w:i w:val="false"/>
+          <w:iCs w:val="false"/>
+          <w:sz w:val="21"/>
+          <w:szCs w:val="21"/>
+        </w:rPr>
+        <w:t xml:space="preserve"> (Boards Manager).</w:t>
       </w:r>
     </w:p>
     <w:p>
@@ -2233,7 +2233,7 @@
           <w:sz w:val="20"/>
           <w:szCs w:val="20"/>
         </w:rPr>
-        <w:t xml:space="preserve">Advertises as DVT-S3-xxxx. See §5 for the phone side (nRF Connect RSSI).</w:t>
+        <w:t>Advertises as DVT-S3-xxxx. See §5 for the phone side (RSSI in a BLE scanner app on your phone).</w:t>
       </w:r>
     </w:p>
     <w:p>
@@ -2405,7 +2405,7 @@
           <w:sz w:val="27"/>
           <w:szCs w:val="27"/>
         </w:rPr>
-        <w:t xml:space="preserve">5.  Phone Side: nRF Connect (RF-B-01)</w:t>
+        <w:t>5.  Phone Side: BLE Scanner App (RF-B-01)</w:t>
       </w:r>
     </w:p>
     <w:p>
@@ -2435,7 +2435,7 @@
           <w:sz w:val="21"/>
           <w:szCs w:val="21"/>
         </w:rPr>
-        <w:t xml:space="preserve">Install “nRF Connect for Mobile” (Nordic, iOS/Android) — free.</w:t>
+        <w:t>Install a BLE scanner app on your phone (iOS or Android).</w:t>
       </w:r>
     </w:p>
     <w:p>
@@ -2465,7 +2465,7 @@
           <w:sz w:val="20"/>
           <w:szCs w:val="20"/>
         </w:rPr>
-        <w:t xml:space="preserve">Helper → b. In nRF Connect: SCANNER tab → pull to refresh.</w:t>
+        <w:t>Helper → b. In the scanner app, start a scan.</w:t>
       </w:r>
     </w:p>
     <w:p>
@@ -2697,19 +2697,19 @@
           <w:sz w:val="21"/>
           <w:szCs w:val="21"/>
         </w:rPr>
-        <w:t xml:space="preserve">The USB-UART adapter (SH-U09C5) </w:t>
-      </w:r>
-      <w:r>
-        <w:rPr>
-          <w:rFonts w:ascii="Calibri" w:cs="Calibri" w:eastAsia="Calibri" w:hAnsi="Calibri"/>
-          <w:b w:val="false"/>
-          <w:bCs w:val="false"/>
-          <w:i w:val="false"/>
-          <w:iCs w:val="false"/>
-          <w:sz w:val="21"/>
-          <w:szCs w:val="21"/>
-        </w:rPr>
-        <w:t xml:space="preserve">is only for MCU-06, proving the header UART works: set the adapter to 3.3 V — GND→J4.1, adapter RX→J4.10, adapter TX→J4.9 — open that COM port at 115200, tap RESET, and the ROM boot log should appear there.</w:t>
+        <w:t xml:space="preserve">A 3.3 V USB-UART adapter </w:t>
+      </w:r>
+      <w:r>
+        <w:rPr>
+          <w:rFonts w:ascii="Calibri" w:cs="Calibri" w:eastAsia="Calibri" w:hAnsi="Calibri"/>
+          <w:b w:val="false"/>
+          <w:bCs w:val="false"/>
+          <w:i w:val="false"/>
+          <w:iCs w:val="false"/>
+          <w:sz w:val="21"/>
+          <w:szCs w:val="21"/>
+        </w:rPr>
+        <w:t>is only for MCU-06, proving the header UART works: set the adapter to 3.3 V — GND → J4.1, adapter RX → J4.9 (TX), adapter TX → J4.10 (RX) — open that COM port at 115200, tap RESET, and the ROM boot log should appear there.</w:t>
       </w:r>
     </w:p>
     <w:p>
@@ -2981,19 +2981,18 @@
           <w:sz w:val="20"/>
           <w:szCs w:val="20"/>
         </w:rPr>
-        <w:t xml:space="preserve">Brownout reset loops on battery: </w:t>
-      </w:r>
-      <w:r>
-        <w:rPr>
-          <w:rFonts w:ascii="Calibri" w:cs="Calibri" w:eastAsia="Calibri" w:hAnsi="Calibri"/>
-          <w:b w:val="false"/>
-          <w:bCs w:val="false"/>
-          <w:i w:val="false"/>
-          <w:iCs w:val="false"/>
-          <w:sz w:val="20"/>
-          <w:szCs w:val="20"/>
-        </w:rPr>
-        <w:t xml:space="preserve">that’s data, not a bug — log it in PWR-07/09.</w:t>
+        <w:t>Low battery: Weather Clock 2.1 shows “Battery low” and sleeps at 3.30 V instead of rebooting; on the helper sketch, a reset loop on a nearly empty cell means the cell is too low — charge it.</w:t>
+      </w:r>
+      <w:r>
+        <w:rPr>
+          <w:rFonts w:ascii="Calibri" w:cs="Calibri" w:eastAsia="Calibri" w:hAnsi="Calibri"/>
+          <w:b w:val="false"/>
+          <w:bCs w:val="false"/>
+          <w:i w:val="false"/>
+          <w:iCs w:val="false"/>
+          <w:sz w:val="20"/>
+          <w:szCs w:val="20"/>
+        </w:rPr>
       </w:r>
     </w:p>
     <w:sectPr>

</xml_diff>